<commit_message>
docs: CLAUDE-3 sync for wave 89 — CHANGELOG (HXC-1629/1630) + PRR item-46 PASS (61/80) + govulncheck gap update; regenerate exports; docs_chain in-sync
Co-Authored-By: Claude Opus 4.8 <noreply@anthropic.com>
</commit_message>
<xml_diff>
--- a/docs/export/PRODUCTION_READINESS_REVIEW.docx
+++ b/docs/export/PRODUCTION_READINESS_REVIEW.docx
@@ -4331,7 +4331,7 @@
               <w:pStyle w:val="Compact"/>
             </w:pPr>
             <w:r>
-              <w:t xml:space="preserve">NOT-READY</w:t>
+              <w:t xml:space="preserve">PASS</w:t>
             </w:r>
           </w:p>
         </w:tc>
@@ -4360,37 +4360,73 @@
               <w:t xml:space="preserve"> </w:t>
             </w:r>
             <w:r>
-              <w:t xml:space="preserve">are commented</w:t>
-            </w:r>
-            <w:r>
-              <w:t xml:space="preserve"> </w:t>
-            </w:r>
-            <w:r>
-              <w:rPr>
-                <w:rStyle w:val="VerbatimChar"/>
-              </w:rPr>
-              <w:t xml:space="preserve"># Placeholder:</w:t>
-            </w:r>
-            <w:r>
-              <w:t xml:space="preserve"> </w:t>
-            </w:r>
-            <w:r>
-              <w:t xml:space="preserve">lines (3 placeholder markers); no executable migration step.</w:t>
-            </w:r>
-            <w:r>
-              <w:t xml:space="preserve"> </w:t>
-            </w:r>
-            <w:r>
-              <w:rPr>
-                <w:rStyle w:val="VerbatimChar"/>
-              </w:rPr>
-              <w:t xml:space="preserve">scripts/run-migrations.sh</w:t>
-            </w:r>
-            <w:r>
-              <w:t xml:space="preserve"> </w:t>
-            </w:r>
-            <w:r>
-              <w:t xml:space="preserve">exists but is not invoked by the documented Make target.</w:t>
+              <w:t xml:space="preserve">now invoke</w:t>
+            </w:r>
+            <w:r>
+              <w:t xml:space="preserve"> </w:t>
+            </w:r>
+            <w:r>
+              <w:rPr>
+                <w:rStyle w:val="VerbatimChar"/>
+              </w:rPr>
+              <w:t xml:space="preserve">scripts/run-migrations.sh up</w:t>
+            </w:r>
+            <w:r>
+              <w:t xml:space="preserve">/</w:t>
+            </w:r>
+            <w:r>
+              <w:rPr>
+                <w:rStyle w:val="VerbatimChar"/>
+              </w:rPr>
+              <w:t xml:space="preserve">down 1</w:t>
+            </w:r>
+            <w:r>
+              <w:t xml:space="preserve"> </w:t>
+            </w:r>
+            <w:r>
+              <w:t xml:space="preserve">(honor</w:t>
+            </w:r>
+            <w:r>
+              <w:t xml:space="preserve"> </w:t>
+            </w:r>
+            <w:r>
+              <w:rPr>
+                <w:rStyle w:val="VerbatimChar"/>
+              </w:rPr>
+              <w:t xml:space="preserve">DATABASE_URL</w:t>
+            </w:r>
+            <w:r>
+              <w:t xml:space="preserve">, no hardcoded secret). Verified against a real podman postgres:</w:t>
+            </w:r>
+            <w:r>
+              <w:t xml:space="preserve"> </w:t>
+            </w:r>
+            <w:r>
+              <w:rPr>
+                <w:rStyle w:val="VerbatimChar"/>
+              </w:rPr>
+              <w:t xml:space="preserve">make migrate-up</w:t>
+            </w:r>
+            <w:r>
+              <w:t xml:space="preserve"> </w:t>
+            </w:r>
+            <w:r>
+              <w:t xml:space="preserve">applied all 15 migrations (schema_migrations v15, 22 tables),</w:t>
+            </w:r>
+            <w:r>
+              <w:t xml:space="preserve"> </w:t>
+            </w:r>
+            <w:r>
+              <w:rPr>
+                <w:rStyle w:val="VerbatimChar"/>
+              </w:rPr>
+              <w:t xml:space="preserve">make migrate-down</w:t>
+            </w:r>
+            <w:r>
+              <w:t xml:space="preserve"> </w:t>
+            </w:r>
+            <w:r>
+              <w:t xml:space="preserve">rolled back exactly 1 (v14) (HXC-1629).</w:t>
             </w:r>
           </w:p>
         </w:tc>
@@ -7497,7 +7533,7 @@
               <w:pStyle w:val="Compact"/>
             </w:pPr>
             <w:r>
-              <w:t xml:space="preserve">60</w:t>
+              <w:t xml:space="preserve">61</w:t>
             </w:r>
           </w:p>
         </w:tc>
@@ -7545,7 +7581,7 @@
               <w:pStyle w:val="Compact"/>
             </w:pPr>
             <w:r>
-              <w:t xml:space="preserve">8</w:t>
+              <w:t xml:space="preserve">7</w:t>
             </w:r>
           </w:p>
         </w:tc>
@@ -7592,7 +7628,7 @@
           <w:b/>
           <w:bCs/>
         </w:rPr>
-        <w:t xml:space="preserve">Honest completion = 60 / 80 = 75.0% PASS.</w:t>
+        <w:t xml:space="preserve">Honest completion = 61 / 80 = 76.25% PASS.</w:t>
       </w:r>
     </w:p>
     <w:p>
@@ -7627,7 +7663,7 @@
           <w:b/>
           <w:bCs/>
         </w:rPr>
-        <w:t xml:space="preserve">The nominal close bar is ≥95%. The honest PASS rate is 75.0%, which does NOT meet the bar.</w:t>
+        <w:t xml:space="preserve">The nominal close bar is ≥95%. The honest PASS rate is 76.25%, which does NOT meet the bar.</w:t>
       </w:r>
       <w:r>
         <w:t xml:space="preserve"> </w:t>
@@ -7868,28 +7904,7 @@
         <w:t xml:space="preserve"> </w:t>
       </w:r>
       <w:r>
-        <w:t xml:space="preserve">Add</w:t>
-      </w:r>
-      <w:r>
-        <w:t xml:space="preserve"> </w:t>
-      </w:r>
-      <w:r>
-        <w:rPr>
-          <w:rStyle w:val="VerbatimChar"/>
-        </w:rPr>
-        <w:t xml:space="preserve">govulncheck</w:t>
-      </w:r>
-      <w:r>
-        <w:t xml:space="preserve"> </w:t>
-      </w:r>
-      <w:r>
-        <w:t xml:space="preserve">+ SBOM (and a</w:t>
-      </w:r>
-      <w:r>
-        <w:t xml:space="preserve"> </w:t>
-      </w:r>
-      <w:r>
-        <w:t xml:space="preserve">dependabot/renovate config) and gate it in CI.</w:t>
+        <w:t xml:space="preserve">govulncheck now RUN (HXC-1630, evidence qa-results/security/) — found 10 reachable advisories (fixes tracked HXC-1631 toolchain + HXC-1632 x/net); SBOM + dependabot/renovate still pending.</w:t>
       </w:r>
     </w:p>
     <w:p>
@@ -7905,58 +7920,13 @@
           <w:b/>
           <w:bCs/>
         </w:rPr>
-        <w:t xml:space="preserve">Migration runner is a placeholder (item 46).</w:t>
-      </w:r>
-      <w:r>
-        <w:t xml:space="preserve"> </w:t>
-      </w:r>
-      <w:r>
-        <w:t xml:space="preserve">Wire</w:t>
-      </w:r>
-      <w:r>
-        <w:t xml:space="preserve"> </w:t>
-      </w:r>
-      <w:r>
-        <w:rPr>
-          <w:rStyle w:val="VerbatimChar"/>
-        </w:rPr>
-        <w:t xml:space="preserve">Makefile:migrate-up/down</w:t>
-      </w:r>
-      <w:r>
-        <w:t xml:space="preserve"> </w:t>
-      </w:r>
-      <w:r>
-        <w:t xml:space="preserve">to</w:t>
-      </w:r>
-      <w:r>
-        <w:t xml:space="preserve"> </w:t>
-      </w:r>
-      <w:r>
-        <w:rPr>
-          <w:rStyle w:val="VerbatimChar"/>
-        </w:rPr>
-        <w:t xml:space="preserve">scripts/run-migrations.sh</w:t>
-      </w:r>
-      <w:r>
-        <w:t xml:space="preserve"> </w:t>
-      </w:r>
-      <w:r>
-        <w:t xml:space="preserve">(or a real</w:t>
-      </w:r>
-      <w:r>
-        <w:t xml:space="preserve"> </w:t>
-      </w:r>
-      <w:r>
-        <w:rPr>
-          <w:rStyle w:val="VerbatimChar"/>
-        </w:rPr>
-        <w:t xml:space="preserve">migrate</w:t>
-      </w:r>
-      <w:r>
-        <w:t xml:space="preserve"> </w:t>
-      </w:r>
-      <w:r>
-        <w:t xml:space="preserve">invocation) instead of commented stubs.</w:t>
+        <w:t xml:space="preserve">Migration runner (item 46) — RESOLVED (HXC-1629).</w:t>
+      </w:r>
+      <w:r>
+        <w:t xml:space="preserve"> </w:t>
+      </w:r>
+      <w:r>
+        <w:t xml:space="preserve">Makefile migrate-up/down now invoke scripts/run-migrations.sh, verified against a real postgres.</w:t>
       </w:r>
     </w:p>
     <w:p>

</xml_diff>

<commit_message>
docs: CLAUDE-3 sync for wave 90 — CHANGELOG (HXC-1631/1632 govulncheck-clear) + PRR item 34 PARTIAL (vulns fixed); regenerate exports; docs_chain in-sync
Co-Authored-By: Claude Opus 4.8 <noreply@anthropic.com>
</commit_message>
<xml_diff>
--- a/docs/export/PRODUCTION_READINESS_REVIEW.docx
+++ b/docs/export/PRODUCTION_READINESS_REVIEW.docx
@@ -3312,72 +3312,36 @@
               <w:pStyle w:val="Compact"/>
             </w:pPr>
             <w:r>
-              <w:t xml:space="preserve">NOT-READY</w:t>
-            </w:r>
-          </w:p>
-        </w:tc>
-        <w:tc>
-          <w:tcPr/>
-          <w:p>
-            <w:pPr>
-              <w:pStyle w:val="Compact"/>
-            </w:pPr>
-            <w:r>
-              <w:t xml:space="preserve">No</w:t>
-            </w:r>
-            <w:r>
-              <w:t xml:space="preserve"> </w:t>
-            </w:r>
-            <w:r>
-              <w:rPr>
-                <w:rStyle w:val="VerbatimChar"/>
-              </w:rPr>
-              <w:t xml:space="preserve">govulncheck</w:t>
-            </w:r>
-            <w:r>
-              <w:t xml:space="preserve">,</w:t>
-            </w:r>
-            <w:r>
-              <w:t xml:space="preserve"> </w:t>
-            </w:r>
-            <w:r>
-              <w:rPr>
-                <w:rStyle w:val="VerbatimChar"/>
-              </w:rPr>
-              <w:t xml:space="preserve">sbom</w:t>
-            </w:r>
-            <w:r>
-              <w:t xml:space="preserve">, or</w:t>
-            </w:r>
-            <w:r>
-              <w:t xml:space="preserve"> </w:t>
-            </w:r>
-            <w:r>
-              <w:rPr>
-                <w:rStyle w:val="VerbatimChar"/>
-              </w:rPr>
-              <w:t xml:space="preserve">trivy</w:t>
-            </w:r>
-            <w:r>
-              <w:t xml:space="preserve"> </w:t>
-            </w:r>
-            <w:r>
-              <w:t xml:space="preserve">references found in</w:t>
-            </w:r>
-            <w:r>
-              <w:t xml:space="preserve"> </w:t>
-            </w:r>
-            <w:r>
-              <w:rPr>
-                <w:rStyle w:val="VerbatimChar"/>
-              </w:rPr>
-              <w:t xml:space="preserve">scripts/</w:t>
-            </w:r>
-            <w:r>
-              <w:t xml:space="preserve"> </w:t>
-            </w:r>
-            <w:r>
-              <w:t xml:space="preserve">or disabled workflows. No supply-chain scan gate.</w:t>
+              <w:t xml:space="preserve">PARTIAL</w:t>
+            </w:r>
+          </w:p>
+        </w:tc>
+        <w:tc>
+          <w:tcPr/>
+          <w:p>
+            <w:pPr>
+              <w:pStyle w:val="Compact"/>
+            </w:pPr>
+            <w:r>
+              <w:rPr>
+                <w:rStyle w:val="VerbatimChar"/>
+              </w:rPr>
+              <w:t xml:space="preserve">govulncheck@v1.3.0</w:t>
+            </w:r>
+            <w:r>
+              <w:t xml:space="preserve"> </w:t>
+            </w:r>
+            <w:r>
+              <w:t xml:space="preserve">now RUN over main/api/v1/security (HXC-1630) and all reachable advisories FIXED (HXC-1631 toolchain go1.26.4 + HXC-1632 x/net v0.55.0; current scan =</w:t>
+            </w:r>
+            <w:r>
+              <w:t xml:space="preserve"> </w:t>
+            </w:r>
+            <w:r>
+              <w:t xml:space="preserve">“No vulnerabilities found”</w:t>
+            </w:r>
+            <w:r>
+              <w:t xml:space="preserve">). SBOM generation + dependabot/renovate config + a continuous gate still pending.</w:t>
             </w:r>
           </w:p>
         </w:tc>
@@ -7557,7 +7521,7 @@
               <w:pStyle w:val="Compact"/>
             </w:pPr>
             <w:r>
-              <w:t xml:space="preserve">12</w:t>
+              <w:t xml:space="preserve">13</w:t>
             </w:r>
           </w:p>
         </w:tc>
@@ -7581,7 +7545,7 @@
               <w:pStyle w:val="Compact"/>
             </w:pPr>
             <w:r>
-              <w:t xml:space="preserve">7</w:t>
+              <w:t xml:space="preserve">6</w:t>
             </w:r>
           </w:p>
         </w:tc>
@@ -7898,13 +7862,22 @@
           <w:b/>
           <w:bCs/>
         </w:rPr>
-        <w:t xml:space="preserve">Supply-chain / vuln scanning (items 34, 80).</w:t>
-      </w:r>
-      <w:r>
-        <w:t xml:space="preserve"> </w:t>
-      </w:r>
-      <w:r>
-        <w:t xml:space="preserve">govulncheck now RUN (HXC-1630, evidence qa-results/security/) — found 10 reachable advisories (fixes tracked HXC-1631 toolchain + HXC-1632 x/net); SBOM + dependabot/renovate still pending.</w:t>
+        <w:t xml:space="preserve">Supply-chain / vuln scanning (items 34, 80) — vulns CLEARED.</w:t>
+      </w:r>
+      <w:r>
+        <w:t xml:space="preserve"> </w:t>
+      </w:r>
+      <w:r>
+        <w:t xml:space="preserve">govulncheck run (HXC-1630) found 10 reachable advisories, now ALL FIXED (HXC-1631 toolchain go1.26.4 + HXC-1632 x/net v0.55.0; scan =</w:t>
+      </w:r>
+      <w:r>
+        <w:t xml:space="preserve"> </w:t>
+      </w:r>
+      <w:r>
+        <w:t xml:space="preserve">“No vulnerabilities found”</w:t>
+      </w:r>
+      <w:r>
+        <w:t xml:space="preserve">). Remaining: SBOM + dependabot/renovate + a continuous gate.</w:t>
       </w:r>
     </w:p>
     <w:p>

</xml_diff>

<commit_message>
docs: CLAUDE-3 sync for wave 92 — CHANGELOG (HXC-1633/1634/1635/1561) + PRR 65/80 (WG/GPU PASS, SBOM PARTIAL); regenerate exports; docs_chain in-sync
Co-Authored-By: Claude Opus 4.8 <noreply@anthropic.com>
</commit_message>
<xml_diff>
--- a/docs/export/PRODUCTION_READINESS_REVIEW.docx
+++ b/docs/export/PRODUCTION_READINESS_REVIEW.docx
@@ -5845,42 +5845,54 @@
               <w:pStyle w:val="Compact"/>
             </w:pPr>
             <w:r>
-              <w:t xml:space="preserve">PARTIAL</w:t>
-            </w:r>
-          </w:p>
-        </w:tc>
-        <w:tc>
-          <w:tcPr/>
-          <w:p>
-            <w:pPr>
-              <w:pStyle w:val="Compact"/>
-            </w:pPr>
-            <w:r>
-              <w:rPr>
-                <w:rStyle w:val="VerbatimChar"/>
-              </w:rPr>
-              <w:t xml:space="preserve">pkg/device/probe_other.go</w:t>
-            </w:r>
-            <w:r>
-              <w:t xml:space="preserve"> </w:t>
-            </w:r>
-            <w:r>
-              <w:t xml:space="preserve">present; darwin-specific probe not confirmed (only an</w:t>
-            </w:r>
-            <w:r>
-              <w:t xml:space="preserve"> </w:t>
-            </w:r>
-            <w:r>
-              <w:rPr>
-                <w:rStyle w:val="VerbatimChar"/>
-              </w:rPr>
-              <w:t xml:space="preserve">_other</w:t>
-            </w:r>
-            <w:r>
-              <w:t xml:space="preserve"> </w:t>
-            </w:r>
-            <w:r>
-              <w:t xml:space="preserve">fallback was located in this review).</w:t>
+              <w:t xml:space="preserve">PASS</w:t>
+            </w:r>
+          </w:p>
+        </w:tc>
+        <w:tc>
+          <w:tcPr/>
+          <w:p>
+            <w:pPr>
+              <w:pStyle w:val="Compact"/>
+            </w:pPr>
+            <w:r>
+              <w:rPr>
+                <w:rStyle w:val="VerbatimChar"/>
+              </w:rPr>
+              <w:t xml:space="preserve">pkg/device/probe_gpu_darwin.go</w:t>
+            </w:r>
+            <w:r>
+              <w:t xml:space="preserve"> </w:t>
+            </w:r>
+            <w:r>
+              <w:t xml:space="preserve">(darwin) probes via</w:t>
+            </w:r>
+            <w:r>
+              <w:t xml:space="preserve"> </w:t>
+            </w:r>
+            <w:r>
+              <w:rPr>
+                <w:rStyle w:val="VerbatimChar"/>
+              </w:rPr>
+              <w:t xml:space="preserve">system_profiler -json</w:t>
+            </w:r>
+            <w:r>
+              <w:t xml:space="preserve">;</w:t>
+            </w:r>
+            <w:r>
+              <w:t xml:space="preserve"> </w:t>
+            </w:r>
+            <w:r>
+              <w:rPr>
+                <w:rStyle w:val="VerbatimChar"/>
+              </w:rPr>
+              <w:t xml:space="preserve">probe_gpu_other.go</w:t>
+            </w:r>
+            <w:r>
+              <w:t xml:space="preserve"> </w:t>
+            </w:r>
+            <w:r>
+              <w:t xml:space="preserve">is the non-darwin fallback. Real-host oracle match: Apple M3 Pro, 19327352832 B VRAM, metal=true (HXC-1634).</w:t>
             </w:r>
           </w:p>
         </w:tc>
@@ -5915,36 +5927,81 @@
               <w:pStyle w:val="Compact"/>
             </w:pPr>
             <w:r>
-              <w:t xml:space="preserve">PARTIAL</w:t>
-            </w:r>
-          </w:p>
-        </w:tc>
-        <w:tc>
-          <w:tcPr/>
-          <w:p>
-            <w:pPr>
-              <w:pStyle w:val="Compact"/>
-            </w:pPr>
-            <w:r>
-              <w:rPr>
-                <w:rStyle w:val="VerbatimChar"/>
-              </w:rPr>
-              <w:t xml:space="preserve">internal/gpu/detect_other.go</w:t>
-            </w:r>
-            <w:r>
-              <w:t xml:space="preserve"> </w:t>
-            </w:r>
-            <w:r>
-              <w:t xml:space="preserve">exists; a real darwin (</w:t>
-            </w:r>
-            <w:r>
-              <w:rPr>
-                <w:rStyle w:val="VerbatimChar"/>
-              </w:rPr>
-              <w:t xml:space="preserve">Metal</w:t>
-            </w:r>
-            <w:r>
-              <w:t xml:space="preserve">/IOKit) detector was not confirmed in this review.</w:t>
+              <w:t xml:space="preserve">PASS</w:t>
+            </w:r>
+          </w:p>
+        </w:tc>
+        <w:tc>
+          <w:tcPr/>
+          <w:p>
+            <w:pPr>
+              <w:pStyle w:val="Compact"/>
+            </w:pPr>
+            <w:r>
+              <w:rPr>
+                <w:rStyle w:val="VerbatimChar"/>
+              </w:rPr>
+              <w:t xml:space="preserve">internal/gpu/detect_darwin.go</w:t>
+            </w:r>
+            <w:r>
+              <w:t xml:space="preserve"> </w:t>
+            </w:r>
+            <w:r>
+              <w:t xml:space="preserve">(//go:build darwin) is a REAL darwin detector (system_profiler/Metal via</w:t>
+            </w:r>
+            <w:r>
+              <w:t xml:space="preserve"> </w:t>
+            </w:r>
+            <w:r>
+              <w:rPr>
+                <w:rStyle w:val="VerbatimChar"/>
+              </w:rPr>
+              <w:t xml:space="preserve">backend_darwin_apple.go</w:t>
+            </w:r>
+            <w:r>
+              <w:t xml:space="preserve">);</w:t>
+            </w:r>
+            <w:r>
+              <w:t xml:space="preserve"> </w:t>
+            </w:r>
+            <w:r>
+              <w:rPr>
+                <w:rStyle w:val="VerbatimChar"/>
+              </w:rPr>
+              <w:t xml:space="preserve">detect_linux.go</w:t>
+            </w:r>
+            <w:r>
+              <w:t xml:space="preserve"> </w:t>
+            </w:r>
+            <w:r>
+              <w:t xml:space="preserve">covers Linux;</w:t>
+            </w:r>
+            <w:r>
+              <w:t xml:space="preserve"> </w:t>
+            </w:r>
+            <w:r>
+              <w:rPr>
+                <w:rStyle w:val="VerbatimChar"/>
+              </w:rPr>
+              <w:t xml:space="preserve">detect_other.go</w:t>
+            </w:r>
+            <w:r>
+              <w:t xml:space="preserve"> </w:t>
+            </w:r>
+            <w:r>
+              <w:t xml:space="preserve">is correctly scoped</w:t>
+            </w:r>
+            <w:r>
+              <w:t xml:space="preserve"> </w:t>
+            </w:r>
+            <w:r>
+              <w:rPr>
+                <w:rStyle w:val="VerbatimChar"/>
+              </w:rPr>
+              <w:t xml:space="preserve">!linux &amp;&amp; !darwin</w:t>
+            </w:r>
+            <w:r>
+              <w:t xml:space="preserve">. (Prior PARTIAL was a review under-assessment.)</w:t>
             </w:r>
           </w:p>
         </w:tc>
@@ -5979,77 +6036,142 @@
               <w:pStyle w:val="Compact"/>
             </w:pPr>
             <w:r>
-              <w:t xml:space="preserve">NOT-READY</w:t>
-            </w:r>
-          </w:p>
-        </w:tc>
-        <w:tc>
-          <w:tcPr/>
-          <w:p>
-            <w:pPr>
-              <w:pStyle w:val="Compact"/>
-            </w:pPr>
-            <w:r>
-              <w:rPr>
-                <w:rStyle w:val="VerbatimChar"/>
-              </w:rPr>
-              <w:t xml:space="preserve">pkg/wireguard/manager.go</w:t>
-            </w:r>
-            <w:r>
-              <w:t xml:space="preserve"> </w:t>
-            </w:r>
-            <w:r>
-              <w:t xml:space="preserve">uses kernel</w:t>
-            </w:r>
-            <w:r>
-              <w:t xml:space="preserve"> </w:t>
-            </w:r>
-            <w:r>
-              <w:rPr>
-                <w:rStyle w:val="VerbatimChar"/>
-              </w:rPr>
-              <w:t xml:space="preserve">wgctrl.New()</w:t>
-            </w:r>
-            <w:r>
-              <w:t xml:space="preserve"> </w:t>
-            </w:r>
-            <w:r>
-              <w:t xml:space="preserve">(Linux netlink) with</w:t>
-            </w:r>
-            <w:r>
-              <w:t xml:space="preserve"> </w:t>
-            </w:r>
-            <w:r>
-              <w:rPr>
-                <w:b/>
-                <w:bCs/>
-              </w:rPr>
-              <w:t xml:space="preserve">no darwin</w:t>
-            </w:r>
-            <w:r>
-              <w:rPr>
-                <w:b/>
-                <w:bCs/>
-              </w:rPr>
-              <w:t xml:space="preserve"> </w:t>
-            </w:r>
-            <w:r>
-              <w:rPr>
-                <w:rStyle w:val="VerbatimChar"/>
-                <w:b/>
-                <w:bCs/>
-              </w:rPr>
-              <w:t xml:space="preserve">wireguard-go</w:t>
-            </w:r>
-            <w:r>
-              <w:rPr>
-                <w:b/>
-                <w:bCs/>
-              </w:rPr>
-              <w:t xml:space="preserve">/userspace build-tag variant</w:t>
-            </w:r>
-            <w:r>
-              <w:t xml:space="preserve">; only a</w:t>
+              <w:t xml:space="preserve">PASS</w:t>
+            </w:r>
+          </w:p>
+        </w:tc>
+        <w:tc>
+          <w:tcPr/>
+          <w:p>
+            <w:pPr>
+              <w:pStyle w:val="Compact"/>
+            </w:pPr>
+            <w:r>
+              <w:rPr>
+                <w:rStyle w:val="VerbatimChar"/>
+              </w:rPr>
+              <w:t xml:space="preserve">pkg/wireguard/netstack_darwin.go</w:t>
+            </w:r>
+            <w:r>
+              <w:t xml:space="preserve"> </w:t>
+            </w:r>
+            <w:r>
+              <w:t xml:space="preserve">(//go:build darwin) implements a REAL userspace WireGuard via gVisor netstack (</w:t>
+            </w:r>
+            <w:r>
+              <w:rPr>
+                <w:rStyle w:val="VerbatimChar"/>
+              </w:rPr>
+              <w:t xml:space="preserve">netstack.CreateNetTUN</w:t>
+            </w:r>
+            <w:r>
+              <w:t xml:space="preserve"> </w:t>
+            </w:r>
+            <w:r>
+              <w:t xml:space="preserve">+</w:t>
+            </w:r>
+            <w:r>
+              <w:t xml:space="preserve"> </w:t>
+            </w:r>
+            <w:r>
+              <w:rPr>
+                <w:rStyle w:val="VerbatimChar"/>
+              </w:rPr>
+              <w:t xml:space="preserve">device.NewDevice</w:t>
+            </w:r>
+            <w:r>
+              <w:t xml:space="preserve"> </w:t>
+            </w:r>
+            <w:r>
+              <w:t xml:space="preserve">+</w:t>
+            </w:r>
+            <w:r>
+              <w:t xml:space="preserve"> </w:t>
+            </w:r>
+            <w:r>
+              <w:rPr>
+                <w:rStyle w:val="VerbatimChar"/>
+              </w:rPr>
+              <w:t xml:space="preserve">conn.NewDefaultBind</w:t>
+            </w:r>
+            <w:r>
+              <w:t xml:space="preserve">); no root. Test moves real TCP traffic through the encrypted tunnel between two peers (HXC-1633). Linux</w:t>
+            </w:r>
+            <w:r>
+              <w:t xml:space="preserve"> </w:t>
+            </w:r>
+            <w:r>
+              <w:rPr>
+                <w:rStyle w:val="VerbatimChar"/>
+              </w:rPr>
+              <w:t xml:space="preserve">wgctrl</w:t>
+            </w:r>
+            <w:r>
+              <w:t xml:space="preserve"> </w:t>
+            </w:r>
+            <w:r>
+              <w:t xml:space="preserve">path intact.</w:t>
+            </w:r>
+          </w:p>
+        </w:tc>
+      </w:tr>
+      <w:tr>
+        <w:tc>
+          <w:tcPr/>
+          <w:p>
+            <w:pPr>
+              <w:pStyle w:val="Compact"/>
+            </w:pPr>
+            <w:r>
+              <w:t xml:space="preserve">67</w:t>
+            </w:r>
+          </w:p>
+        </w:tc>
+        <w:tc>
+          <w:tcPr/>
+          <w:p>
+            <w:pPr>
+              <w:pStyle w:val="Compact"/>
+            </w:pPr>
+            <w:r>
+              <w:t xml:space="preserve">No</w:t>
+            </w:r>
+            <w:r>
+              <w:t xml:space="preserve"> </w:t>
+            </w:r>
+            <w:r>
+              <w:rPr>
+                <w:rStyle w:val="VerbatimChar"/>
+              </w:rPr>
+              <w:t xml:space="preserve">!linux</w:t>
+            </w:r>
+            <w:r>
+              <w:t xml:space="preserve"> </w:t>
+            </w:r>
+            <w:r>
+              <w:t xml:space="preserve">stub masquerading as real feature</w:t>
+            </w:r>
+          </w:p>
+        </w:tc>
+        <w:tc>
+          <w:tcPr/>
+          <w:p>
+            <w:pPr>
+              <w:pStyle w:val="Compact"/>
+            </w:pPr>
+            <w:r>
+              <w:t xml:space="preserve">PASS</w:t>
+            </w:r>
+          </w:p>
+        </w:tc>
+        <w:tc>
+          <w:tcPr/>
+          <w:p>
+            <w:pPr>
+              <w:pStyle w:val="Compact"/>
+            </w:pPr>
+            <w:r>
+              <w:t xml:space="preserve">The WireGuard</w:t>
             </w:r>
             <w:r>
               <w:t xml:space="preserve"> </w:t>
@@ -6061,84 +6183,11 @@
               <w:t xml:space="preserve">NoOp</w:t>
             </w:r>
             <w:r>
-              <w:t xml:space="preserve"> </w:t>
-            </w:r>
-            <w:r>
-              <w:t xml:space="preserve">config flag exists. CLAUDE-2 §4 explicitly names this hotspot.</w:t>
-            </w:r>
-            <w:r>
-              <w:t xml:space="preserve"> </w:t>
-            </w:r>
-            <w:r>
-              <w:rPr>
-                <w:rStyle w:val="VerbatimChar"/>
-              </w:rPr>
-              <w:t xml:space="preserve">GOOS=darwin go build</w:t>
-            </w:r>
-            <w:r>
-              <w:t xml:space="preserve"> </w:t>
-            </w:r>
-            <w:r>
-              <w:t xml:space="preserve">compiles but wgctrl is non-functional on macOS at runtime.</w:t>
-            </w:r>
-          </w:p>
-        </w:tc>
-      </w:tr>
-      <w:tr>
-        <w:tc>
-          <w:tcPr/>
-          <w:p>
-            <w:pPr>
-              <w:pStyle w:val="Compact"/>
-            </w:pPr>
-            <w:r>
-              <w:t xml:space="preserve">67</w:t>
-            </w:r>
-          </w:p>
-        </w:tc>
-        <w:tc>
-          <w:tcPr/>
-          <w:p>
-            <w:pPr>
-              <w:pStyle w:val="Compact"/>
-            </w:pPr>
-            <w:r>
-              <w:t xml:space="preserve">No</w:t>
-            </w:r>
-            <w:r>
-              <w:t xml:space="preserve"> </w:t>
-            </w:r>
-            <w:r>
-              <w:rPr>
-                <w:rStyle w:val="VerbatimChar"/>
-              </w:rPr>
-              <w:t xml:space="preserve">!linux</w:t>
-            </w:r>
-            <w:r>
-              <w:t xml:space="preserve"> </w:t>
-            </w:r>
-            <w:r>
-              <w:t xml:space="preserve">stub masquerading as real feature</w:t>
-            </w:r>
-          </w:p>
-        </w:tc>
-        <w:tc>
-          <w:tcPr/>
-          <w:p>
-            <w:pPr>
-              <w:pStyle w:val="Compact"/>
-            </w:pPr>
-            <w:r>
-              <w:t xml:space="preserve">PARTIAL</w:t>
-            </w:r>
-          </w:p>
-        </w:tc>
-        <w:tc>
-          <w:tcPr/>
-          <w:p>
-            <w:pPr>
-              <w:pStyle w:val="Compact"/>
-            </w:pPr>
+              <w:t xml:space="preserve">/stub macOS path is replaced by a real gVisor-netstack darwin device (HXC-1633);</w:t>
+            </w:r>
+            <w:r>
+              <w:t xml:space="preserve"> </w:t>
+            </w:r>
             <w:r>
               <w:rPr>
                 <w:rStyle w:val="VerbatimChar"/>
@@ -6149,7 +6198,7 @@
               <w:t xml:space="preserve"> </w:t>
             </w:r>
             <w:r>
-              <w:t xml:space="preserve">stubs are correctly limited to</w:t>
+              <w:t xml:space="preserve">stubs remain correctly limited to</w:t>
             </w:r>
             <w:r>
               <w:t xml:space="preserve"> </w:t>
@@ -6161,22 +6210,7 @@
               <w:t xml:space="preserve">!linux &amp;&amp; !darwin</w:t>
             </w:r>
             <w:r>
-              <w:t xml:space="preserve">; however the WireGuard</w:t>
-            </w:r>
-            <w:r>
-              <w:t xml:space="preserve"> </w:t>
-            </w:r>
-            <w:r>
-              <w:rPr>
-                <w:rStyle w:val="VerbatimChar"/>
-              </w:rPr>
-              <w:t xml:space="preserve">NoOp</w:t>
-            </w:r>
-            <w:r>
-              <w:t xml:space="preserve"> </w:t>
-            </w:r>
-            <w:r>
-              <w:t xml:space="preserve">path (item 66) is effectively a non-functional fallback on macOS.</w:t>
+              <w:t xml:space="preserve">. No real-operation feature behind a stub on darwin.</w:t>
             </w:r>
           </w:p>
         </w:tc>
@@ -7369,22 +7403,16 @@
               <w:pStyle w:val="Compact"/>
             </w:pPr>
             <w:r>
-              <w:t xml:space="preserve">NOT-READY</w:t>
-            </w:r>
-          </w:p>
-        </w:tc>
-        <w:tc>
-          <w:tcPr/>
-          <w:p>
-            <w:pPr>
-              <w:pStyle w:val="Compact"/>
-            </w:pPr>
-            <w:r>
-              <w:t xml:space="preserve">No dependabot/renovate config found; no</w:t>
-            </w:r>
-            <w:r>
-              <w:t xml:space="preserve"> </w:t>
-            </w:r>
+              <w:t xml:space="preserve">PARTIAL</w:t>
+            </w:r>
+          </w:p>
+        </w:tc>
+        <w:tc>
+          <w:tcPr/>
+          <w:p>
+            <w:pPr>
+              <w:pStyle w:val="Compact"/>
+            </w:pPr>
             <w:r>
               <w:rPr>
                 <w:rStyle w:val="VerbatimChar"/>
@@ -7395,7 +7423,22 @@
               <w:t xml:space="preserve"> </w:t>
             </w:r>
             <w:r>
-              <w:t xml:space="preserve">in scripts or (disabled) CI; combined with item 8 there is no automated dependency-security gate.</w:t>
+              <w:t xml:space="preserve">run + all reachable advisories fixed (HXC-1630/1631/1632) and</w:t>
+            </w:r>
+            <w:r>
+              <w:t xml:space="preserve"> </w:t>
+            </w:r>
+            <w:r>
+              <w:rPr>
+                <w:rStyle w:val="VerbatimChar"/>
+              </w:rPr>
+              <w:t xml:space="preserve">make sbom</w:t>
+            </w:r>
+            <w:r>
+              <w:t xml:space="preserve"> </w:t>
+            </w:r>
+            <w:r>
+              <w:t xml:space="preserve">(cyclonedx-gomod) emits CycloneDX SBOMs (HXC-1635). Remaining: an automated dependency-update mechanism (dependabot/renovate) — note the no-CI constitutional rule constrains the gating form.</w:t>
             </w:r>
           </w:p>
         </w:tc>
@@ -7497,7 +7540,7 @@
               <w:pStyle w:val="Compact"/>
             </w:pPr>
             <w:r>
-              <w:t xml:space="preserve">61</w:t>
+              <w:t xml:space="preserve">65</w:t>
             </w:r>
           </w:p>
         </w:tc>
@@ -7521,7 +7564,7 @@
               <w:pStyle w:val="Compact"/>
             </w:pPr>
             <w:r>
-              <w:t xml:space="preserve">13</w:t>
+              <w:t xml:space="preserve">11</w:t>
             </w:r>
           </w:p>
         </w:tc>
@@ -7545,7 +7588,7 @@
               <w:pStyle w:val="Compact"/>
             </w:pPr>
             <w:r>
-              <w:t xml:space="preserve">6</w:t>
+              <w:t xml:space="preserve">4</w:t>
             </w:r>
           </w:p>
         </w:tc>
@@ -7592,7 +7635,7 @@
           <w:b/>
           <w:bCs/>
         </w:rPr>
-        <w:t xml:space="preserve">Honest completion = 61 / 80 = 76.25% PASS.</w:t>
+        <w:t xml:space="preserve">Honest completion = 65 / 80 = 81.25% PASS.</w:t>
       </w:r>
     </w:p>
     <w:p>
@@ -7627,7 +7670,7 @@
           <w:b/>
           <w:bCs/>
         </w:rPr>
-        <w:t xml:space="preserve">The nominal close bar is ≥95%. The honest PASS rate is 76.25%, which does NOT meet the bar.</w:t>
+        <w:t xml:space="preserve">The nominal close bar is ≥95%. The honest PASS rate is 81.25%, which does NOT meet the bar.</w:t>
       </w:r>
       <w:r>
         <w:t xml:space="preserve"> </w:t>
@@ -7792,61 +7835,13 @@
           <w:b/>
           <w:bCs/>
         </w:rPr>
-        <w:t xml:space="preserve">WireGuard macOS parity (items 66, 67) — CLAUDE-2 violation.</w:t>
+        <w:t xml:space="preserve">WireGuard macOS parity (items 66, 67) — RESOLVED (HXC-1633).</w:t>
       </w:r>
       <w:r>
         <w:t xml:space="preserve"> </w:t>
       </w:r>
       <w:r>
-        <w:rPr>
-          <w:rStyle w:val="VerbatimChar"/>
-        </w:rPr>
-        <w:t xml:space="preserve">pkg/wireguard/manager.go</w:t>
-      </w:r>
-      <w:r>
-        <w:t xml:space="preserve"> </w:t>
-      </w:r>
-      <w:r>
-        <w:t xml:space="preserve">is kernel-</w:t>
-      </w:r>
-      <w:r>
-        <w:rPr>
-          <w:rStyle w:val="VerbatimChar"/>
-        </w:rPr>
-        <w:t xml:space="preserve">wgctrl</w:t>
-      </w:r>
-      <w:r>
-        <w:t xml:space="preserve">-only with a</w:t>
-      </w:r>
-      <w:r>
-        <w:t xml:space="preserve"> </w:t>
-      </w:r>
-      <w:r>
-        <w:rPr>
-          <w:rStyle w:val="VerbatimChar"/>
-        </w:rPr>
-        <w:t xml:space="preserve">NoOp</w:t>
-      </w:r>
-      <w:r>
-        <w:t xml:space="preserve"> </w:t>
-      </w:r>
-      <w:r>
-        <w:t xml:space="preserve">fallback; implement a real</w:t>
-      </w:r>
-      <w:r>
-        <w:t xml:space="preserve"> </w:t>
-      </w:r>
-      <w:r>
-        <w:rPr>
-          <w:rStyle w:val="VerbatimChar"/>
-        </w:rPr>
-        <w:t xml:space="preserve">wireguard-go</w:t>
-      </w:r>
-      <w:r>
-        <w:t xml:space="preserve"> </w:t>
-      </w:r>
-      <w:r>
-        <w:t xml:space="preserve">userspace path behind a darwin build tag.</w:t>
+        <w:t xml:space="preserve">Real gVisor-netstack userspace WireGuard on darwin (pkg/wireguard/netstack_darwin.go); real tunnel datapath tested, no root.</w:t>
       </w:r>
     </w:p>
     <w:p>
@@ -7943,49 +7938,13 @@
           <w:b/>
           <w:bCs/>
         </w:rPr>
-        <w:t xml:space="preserve">Darwin GPU/device detection (items 64, 65).</w:t>
+        <w:t xml:space="preserve">Darwin GPU/device detection (items 64, 65) — RESOLVED (HXC-1634).</w:t>
       </w:r>
       <w:r>
         <w:t xml:space="preserve"> </w:t>
       </w:r>
       <w:r>
-        <w:t xml:space="preserve">Confirm or implement real</w:t>
-      </w:r>
-      <w:r>
-        <w:t xml:space="preserve"> </w:t>
-      </w:r>
-      <w:r>
-        <w:t xml:space="preserve">Metal/IOKit-backed probes for</w:t>
-      </w:r>
-      <w:r>
-        <w:t xml:space="preserve"> </w:t>
-      </w:r>
-      <w:r>
-        <w:rPr>
-          <w:rStyle w:val="VerbatimChar"/>
-        </w:rPr>
-        <w:t xml:space="preserve">internal/gpu</w:t>
-      </w:r>
-      <w:r>
-        <w:t xml:space="preserve"> </w:t>
-      </w:r>
-      <w:r>
-        <w:t xml:space="preserve">and</w:t>
-      </w:r>
-      <w:r>
-        <w:t xml:space="preserve"> </w:t>
-      </w:r>
-      <w:r>
-        <w:rPr>
-          <w:rStyle w:val="VerbatimChar"/>
-        </w:rPr>
-        <w:t xml:space="preserve">pkg/device</w:t>
-      </w:r>
-      <w:r>
-        <w:t xml:space="preserve"> </w:t>
-      </w:r>
-      <w:r>
-        <w:t xml:space="preserve">rather than</w:t>
+        <w:t xml:space="preserve">pkg/device/probe_gpu_darwin.go probes via system_profiler (real-host oracle match); internal/gpu/detect_darwin.go already real. Was:</w:t>
       </w:r>
       <w:r>
         <w:t xml:space="preserve"> </w:t>

</xml_diff>